<commit_message>
Move the occluding legends below the panels in Figures 3, 4 and 6 of paper 1
The in-axes legends sat on top of the series in Figure 3 (all four panels),
Figure 4(a) and Figure 6(a) and 6(c). They now sit below their panel, as the
repository's figure rule requires.

Two things fixed while in there:

- Figure 6(c) was broken independently of the legend: the y-axis was pinned
  to (0.18, 0.27) while the sequencing means run 0.275 to 0.315, so every bar
  was clipped flat against the top of the axes and the panel carried no
  information at all. The limits are now derived from the data, and the
  in-bar labels are positioned relative to the axis rather than at a
  hard-coded height.

- Figure 3(d) plots the vacancy-to-seeker ratio on a right-hand axis but
  never listed it in the legend. It is now named there, with both series
  marked left or right.

Co-Authored-By: Claude Fable 5 <noreply@anthropic.com>
Claude-Session: https://claude.ai/code/session_01UrAdPY9a3KtwM11Px6Pcon
</commit_message>
<xml_diff>
--- a/zhejiang-youth-systems-paper/Youth_School_to_Work_Transition_System_China_Systems.docx
+++ b/zhejiang-youth-systems-paper/Youth_School_to_Work_Transition_System_China_Systems.docx
@@ -17748,7 +17748,7 @@
       <w:r>
         <w:drawing>
           <wp:inline distT="0" distB="0" distL="114300" distR="114300">
-            <wp:extent cx="5989320" cy="4004823"/>
+            <wp:extent cx="5989320" cy="4277286"/>
             <wp:effectExtent l="0" t="0" r="0" b="0"/>
             <wp:docPr id="103" name="Picture 103"/>
             <wp:cNvGraphicFramePr>
@@ -17772,7 +17772,7 @@
                   <pic:spPr>
                     <a:xfrm>
                       <a:off x="0" y="0"/>
-                      <a:ext cx="5989320" cy="4004823"/>
+                      <a:ext cx="5989320" cy="4277286"/>
                     </a:xfrm>
                     <a:prstGeom prst="rect">
                       <a:avLst/>
@@ -21447,7 +21447,7 @@
       <w:r>
         <w:drawing>
           <wp:inline distT="0" distB="0" distL="114300" distR="114300">
-            <wp:extent cx="5989320" cy="2063570"/>
+            <wp:extent cx="5989320" cy="2338069"/>
             <wp:effectExtent l="0" t="0" r="0" b="0"/>
             <wp:docPr id="104" name="Picture 104"/>
             <wp:cNvGraphicFramePr>
@@ -21471,7 +21471,7 @@
                   <pic:spPr>
                     <a:xfrm>
                       <a:off x="0" y="0"/>
-                      <a:ext cx="5989320" cy="2063570"/>
+                      <a:ext cx="5989320" cy="2338069"/>
                     </a:xfrm>
                     <a:prstGeom prst="rect">
                       <a:avLst/>
@@ -31390,7 +31390,7 @@
       <w:r>
         <w:drawing>
           <wp:inline distT="0" distB="0" distL="114300" distR="114300">
-            <wp:extent cx="5989320" cy="2136494"/>
+            <wp:extent cx="5989320" cy="2622379"/>
             <wp:effectExtent l="0" t="0" r="0" b="0"/>
             <wp:docPr id="106" name="Picture 106"/>
             <wp:cNvGraphicFramePr>
@@ -31414,7 +31414,7 @@
                   <pic:spPr>
                     <a:xfrm>
                       <a:off x="0" y="0"/>
-                      <a:ext cx="5989320" cy="2136494"/>
+                      <a:ext cx="5989320" cy="2622379"/>
                     </a:xfrm>
                     <a:prstGeom prst="rect">
                       <a:avLst/>

</xml_diff>